<commit_message>
update manual: ลด image size + เพิ่ม JPEG screenshots
- generate_manual.py: เปลี่ยน images เป็น .jpg (compress) ลดขนาดไฟล์
- คู่มือการใช้งาน_MTECH.docx: rebuild ด้วย JPEG (195KB → 106KB)
- manual_screenshots/*.jpg: JPEG quality-70 สำหรับใช้ใน docx

https://claude.ai/code/session_01Rh92Dmzs8Vd4FgE2bWu2oN
</commit_message>
<xml_diff>
--- a/คู่มือการใช้งาน_MTECH.docx
+++ b/คู่มือการใช้งาน_MTECH.docx
@@ -1810,7 +1810,7 @@
       <w:r>
         <w:drawing>
           <wp:inline xmlns:a="http://schemas.openxmlformats.org/drawingml/2006/main" xmlns:pic="http://schemas.openxmlformats.org/drawingml/2006/picture">
-            <wp:extent cx="5040000" cy="3298909"/>
+            <wp:extent cx="5040000" cy="3294900"/>
             <wp:docPr id="1" name="Picture 1"/>
             <wp:cNvGraphicFramePr>
               <a:graphicFrameLocks noChangeAspect="1"/>
@@ -1819,7 +1819,7 @@
               <a:graphicData uri="http://schemas.openxmlformats.org/drawingml/2006/picture">
                 <pic:pic>
                   <pic:nvPicPr>
-                    <pic:cNvPr id="0" name="ss_settings.png"/>
+                    <pic:cNvPr id="0" name="ss_settings.jpg"/>
                     <pic:cNvPicPr/>
                   </pic:nvPicPr>
                   <pic:blipFill>
@@ -1831,7 +1831,7 @@
                   <pic:spPr>
                     <a:xfrm>
                       <a:off x="0" y="0"/>
-                      <a:ext cx="5040000" cy="3298909"/>
+                      <a:ext cx="5040000" cy="3294900"/>
                     </a:xfrm>
                     <a:prstGeom prst="rect"/>
                   </pic:spPr>
@@ -2677,7 +2677,7 @@
       <w:r>
         <w:drawing>
           <wp:inline xmlns:a="http://schemas.openxmlformats.org/drawingml/2006/main" xmlns:pic="http://schemas.openxmlformats.org/drawingml/2006/picture">
-            <wp:extent cx="5040000" cy="3298909"/>
+            <wp:extent cx="5040000" cy="3294900"/>
             <wp:docPr id="2" name="Picture 2"/>
             <wp:cNvGraphicFramePr>
               <a:graphicFrameLocks noChangeAspect="1"/>
@@ -2686,7 +2686,7 @@
               <a:graphicData uri="http://schemas.openxmlformats.org/drawingml/2006/picture">
                 <pic:pic>
                   <pic:nvPicPr>
-                    <pic:cNvPr id="0" name="ss_dashboard.png"/>
+                    <pic:cNvPr id="0" name="ss_dashboard.jpg"/>
                     <pic:cNvPicPr/>
                   </pic:nvPicPr>
                   <pic:blipFill>
@@ -2698,7 +2698,7 @@
                   <pic:spPr>
                     <a:xfrm>
                       <a:off x="0" y="0"/>
-                      <a:ext cx="5040000" cy="3298909"/>
+                      <a:ext cx="5040000" cy="3294900"/>
                     </a:xfrm>
                     <a:prstGeom prst="rect"/>
                   </pic:spPr>
@@ -3321,7 +3321,7 @@
       <w:r>
         <w:drawing>
           <wp:inline xmlns:a="http://schemas.openxmlformats.org/drawingml/2006/main" xmlns:pic="http://schemas.openxmlformats.org/drawingml/2006/picture">
-            <wp:extent cx="5040000" cy="3298909"/>
+            <wp:extent cx="5040000" cy="3294900"/>
             <wp:docPr id="3" name="Picture 3"/>
             <wp:cNvGraphicFramePr>
               <a:graphicFrameLocks noChangeAspect="1"/>
@@ -3330,7 +3330,7 @@
               <a:graphicData uri="http://schemas.openxmlformats.org/drawingml/2006/picture">
                 <pic:pic>
                   <pic:nvPicPr>
-                    <pic:cNvPr id="0" name="ss_tasks.png"/>
+                    <pic:cNvPr id="0" name="ss_tasks.jpg"/>
                     <pic:cNvPicPr/>
                   </pic:nvPicPr>
                   <pic:blipFill>
@@ -3342,7 +3342,7 @@
                   <pic:spPr>
                     <a:xfrm>
                       <a:off x="0" y="0"/>
-                      <a:ext cx="5040000" cy="3298909"/>
+                      <a:ext cx="5040000" cy="3294900"/>
                     </a:xfrm>
                     <a:prstGeom prst="rect"/>
                   </pic:spPr>
@@ -4635,7 +4635,7 @@
       <w:r>
         <w:drawing>
           <wp:inline xmlns:a="http://schemas.openxmlformats.org/drawingml/2006/main" xmlns:pic="http://schemas.openxmlformats.org/drawingml/2006/picture">
-            <wp:extent cx="5040000" cy="3298909"/>
+            <wp:extent cx="5040000" cy="3294900"/>
             <wp:docPr id="4" name="Picture 4"/>
             <wp:cNvGraphicFramePr>
               <a:graphicFrameLocks noChangeAspect="1"/>
@@ -4644,7 +4644,7 @@
               <a:graphicData uri="http://schemas.openxmlformats.org/drawingml/2006/picture">
                 <pic:pic>
                   <pic:nvPicPr>
-                    <pic:cNvPr id="0" name="ss_logs.png"/>
+                    <pic:cNvPr id="0" name="ss_logs.jpg"/>
                     <pic:cNvPicPr/>
                   </pic:nvPicPr>
                   <pic:blipFill>
@@ -4656,7 +4656,7 @@
                   <pic:spPr>
                     <a:xfrm>
                       <a:off x="0" y="0"/>
-                      <a:ext cx="5040000" cy="3298909"/>
+                      <a:ext cx="5040000" cy="3294900"/>
                     </a:xfrm>
                     <a:prstGeom prst="rect"/>
                   </pic:spPr>

</xml_diff>